<commit_message>
feat: enhance fixture handling and update test case descriptions for improved clarity
</commit_message>
<xml_diff>
--- a/distillation_v2/test_cases/fixtures/simple_report.docx
+++ b/distillation_v2/test_cases/fixtures/simple_report.docx
@@ -6,8 +6,24 @@
       <w:pPr>
         <w:pStyle w:val="Heading1"/>
       </w:pPr>
+      <w:commentRangeStart w:id="0"/>
+      <w:commentRangeStart w:id="0"/>
       <w:r>
         <w:t>Annual Report 2025</w:t>
+      </w:r>
+      <w:commentRangeEnd w:id="0"/>
+      <w:r>
+        <w:rPr>
+          <w:rStyle w:val="CommentReference"/>
+        </w:rPr>
+        <w:commentReference w:id="0"/>
+      </w:r>
+      <w:commentRangeEnd w:id="0"/>
+      <w:r>
+        <w:rPr>
+          <w:rStyle w:val="CommentReference"/>
+        </w:rPr>
+        <w:commentReference w:id="0"/>
       </w:r>
     </w:p>
     <w:p>
@@ -184,6 +200,68 @@
     </w:sectPr>
   </w:body>
 </w:document>
+</file>
+
+<file path=word/comments.xml><?xml version="1.0" encoding="utf-8"?>
+<w:comments xmlns:wpc="http://schemas.microsoft.com/office/word/2010/wordprocessingCanvas" xmlns:cx="http://schemas.microsoft.com/office/drawing/2014/chartex" xmlns:cx1="http://schemas.microsoft.com/office/drawing/2015/9/8/chartex" xmlns:cx2="http://schemas.microsoft.com/office/drawing/2015/10/21/chartex" xmlns:cx3="http://schemas.microsoft.com/office/drawing/2016/5/9/chartex" xmlns:cx4="http://schemas.microsoft.com/office/drawing/2016/5/10/chartex" xmlns:cx5="http://schemas.microsoft.com/office/drawing/2016/5/11/chartex" xmlns:cx6="http://schemas.microsoft.com/office/drawing/2016/5/12/chartex" xmlns:cx7="http://schemas.microsoft.com/office/drawing/2016/5/13/chartex" xmlns:cx8="http://schemas.microsoft.com/office/drawing/2016/5/14/chartex" xmlns:mc="http://schemas.openxmlformats.org/markup-compatibility/2006" xmlns:aink="http://schemas.microsoft.com/office/drawing/2016/ink" xmlns:am3d="http://schemas.microsoft.com/office/drawing/2017/model3d" xmlns:o="urn:schemas-microsoft-com:office:office" xmlns:oel="http://schemas.microsoft.com/office/2019/extlst" xmlns:r="http://schemas.openxmlformats.org/officeDocument/2006/relationships" xmlns:m="http://schemas.openxmlformats.org/officeDocument/2006/math" xmlns:v="urn:schemas-microsoft-com:vml" xmlns:wp14="http://schemas.microsoft.com/office/word/2010/wordprocessingDrawing" xmlns:wp="http://schemas.openxmlformats.org/drawingml/2006/wordprocessingDrawing" xmlns:w10="urn:schemas-microsoft-com:office:word" xmlns:w="http://schemas.openxmlformats.org/wordprocessingml/2006/main" xmlns:w14="http://schemas.microsoft.com/office/word/2010/wordml" xmlns:w15="http://schemas.microsoft.com/office/word/2012/wordml" xmlns:w16cex="http://schemas.microsoft.com/office/word/2018/wordml/cex" xmlns:w16cid="http://schemas.microsoft.com/office/word/2016/wordml/cid" xmlns:w16="http://schemas.microsoft.com/office/word/2018/wordml" xmlns:w16du="http://schemas.microsoft.com/office/word/2023/wordml/word16du" xmlns:w16sdtdh="http://schemas.microsoft.com/office/word/2020/wordml/sdtdatahash" xmlns:w16sdtfl="http://schemas.microsoft.com/office/word/2024/wordml/sdtformatlock" xmlns:w16se="http://schemas.microsoft.com/office/word/2015/wordml/symex" xmlns:wpg="http://schemas.microsoft.com/office/word/2010/wordprocessingGroup" xmlns:wpi="http://schemas.microsoft.com/office/word/2010/wordprocessingInk" xmlns:wne="http://schemas.microsoft.com/office/word/2006/wordml" xmlns:wps="http://schemas.microsoft.com/office/word/2010/wordprocessingShape" mc:Ignorable="w14 w15 w16se w16cid w16 w16cex w16sdtdh w16sdtfl w16du wp14">
+  <w:comment w:id="0" w:author="Claude" w:date="2026-05-06T16:30:04Z" w:initials="C">
+    <w:p>
+      <w:r>
+        <w:rPr>
+          <w:rStyle w:val="CommentReference"/>
+        </w:rPr>
+        <w:annotationRef/>
+      </w:r>
+      <w:r>
+        <w:rPr>
+          <w:color w:val="000000"/>
+          <w:sz w:val="20"/>
+          <w:szCs w:val="20"/>
+        </w:rPr>
+        <w:t>Clarify this section with recent research</w:t>
+      </w:r>
+    </w:p>
+  </w:comment>
+  <w:comment w:id="0" w:author="Claude" w:date="2026-05-06T16:31:26Z" w:initials="C">
+    <w:p>
+      <w:r>
+        <w:rPr>
+          <w:rStyle w:val="CommentReference"/>
+        </w:rPr>
+        <w:annotationRef/>
+      </w:r>
+      <w:r>
+        <w:rPr>
+          <w:color w:val="000000"/>
+          <w:sz w:val="20"/>
+          <w:szCs w:val="20"/>
+        </w:rPr>
+        <w:t>Clarify this section with recent research</w:t>
+      </w:r>
+    </w:p>
+  </w:comment>
+</w:comments>
+</file>
+
+<file path=word/commentsExtended.xml><?xml version="1.0" encoding="utf-8"?>
+<w15:commentsEx xmlns:wpc="http://schemas.microsoft.com/office/word/2010/wordprocessingCanvas" xmlns:cx="http://schemas.microsoft.com/office/drawing/2014/chartex" xmlns:cx1="http://schemas.microsoft.com/office/drawing/2015/9/8/chartex" xmlns:cx2="http://schemas.microsoft.com/office/drawing/2015/10/21/chartex" xmlns:cx3="http://schemas.microsoft.com/office/drawing/2016/5/9/chartex" xmlns:cx4="http://schemas.microsoft.com/office/drawing/2016/5/10/chartex" xmlns:cx5="http://schemas.microsoft.com/office/drawing/2016/5/11/chartex" xmlns:cx6="http://schemas.microsoft.com/office/drawing/2016/5/12/chartex" xmlns:cx7="http://schemas.microsoft.com/office/drawing/2016/5/13/chartex" xmlns:cx8="http://schemas.microsoft.com/office/drawing/2016/5/14/chartex" xmlns:mc="http://schemas.openxmlformats.org/markup-compatibility/2006" xmlns:aink="http://schemas.microsoft.com/office/drawing/2016/ink" xmlns:am3d="http://schemas.microsoft.com/office/drawing/2017/model3d" xmlns:o="urn:schemas-microsoft-com:office:office" xmlns:oel="http://schemas.microsoft.com/office/2019/extlst" xmlns:r="http://schemas.openxmlformats.org/officeDocument/2006/relationships" xmlns:m="http://schemas.openxmlformats.org/officeDocument/2006/math" xmlns:v="urn:schemas-microsoft-com:vml" xmlns:wp14="http://schemas.microsoft.com/office/word/2010/wordprocessingDrawing" xmlns:wp="http://schemas.openxmlformats.org/drawingml/2006/wordprocessingDrawing" xmlns:w10="urn:schemas-microsoft-com:office:word" xmlns:w="http://schemas.openxmlformats.org/wordprocessingml/2006/main" xmlns:w14="http://schemas.microsoft.com/office/word/2010/wordml" xmlns:w15="http://schemas.microsoft.com/office/word/2012/wordml" xmlns:w16cex="http://schemas.microsoft.com/office/word/2018/wordml/cex" xmlns:w16cid="http://schemas.microsoft.com/office/word/2016/wordml/cid" xmlns:w16="http://schemas.microsoft.com/office/word/2018/wordml" xmlns:w16du="http://schemas.microsoft.com/office/word/2023/wordml/word16du" xmlns:w16sdtdh="http://schemas.microsoft.com/office/word/2020/wordml/sdtdatahash" xmlns:w16sdtfl="http://schemas.microsoft.com/office/word/2024/wordml/sdtformatlock" xmlns:w16se="http://schemas.microsoft.com/office/word/2015/wordml/symex" xmlns:wpg="http://schemas.microsoft.com/office/word/2010/wordprocessingGroup" xmlns:wpi="http://schemas.microsoft.com/office/word/2010/wordprocessingInk" xmlns:wne="http://schemas.microsoft.com/office/word/2006/wordml" xmlns:wps="http://schemas.microsoft.com/office/word/2010/wordprocessingShape" mc:Ignorable="w14 w15 w16se w16cid w16 w16cex w16sdtdh w16sdtfl w16du wp14">
+  <w15:commentEx w15:paraId="7BE2DE87" w15:done="0"/>
+  <w15:commentEx w15:paraId="5CEEDFAF" w15:done="0"/>
+</w15:commentsEx>
+</file>
+
+<file path=word/commentsExtensible.xml><?xml version="1.0" encoding="utf-8"?>
+<w16cex:commentsExtensible xmlns:wpc="http://schemas.microsoft.com/office/word/2010/wordprocessingCanvas" xmlns:cx="http://schemas.microsoft.com/office/drawing/2014/chartex" xmlns:cx1="http://schemas.microsoft.com/office/drawing/2015/9/8/chartex" xmlns:cx2="http://schemas.microsoft.com/office/drawing/2015/10/21/chartex" xmlns:cx3="http://schemas.microsoft.com/office/drawing/2016/5/9/chartex" xmlns:cx4="http://schemas.microsoft.com/office/drawing/2016/5/10/chartex" xmlns:cx5="http://schemas.microsoft.com/office/drawing/2016/5/11/chartex" xmlns:cx6="http://schemas.microsoft.com/office/drawing/2016/5/12/chartex" xmlns:cx7="http://schemas.microsoft.com/office/drawing/2016/5/13/chartex" xmlns:cx8="http://schemas.microsoft.com/office/drawing/2016/5/14/chartex" xmlns:mc="http://schemas.openxmlformats.org/markup-compatibility/2006" xmlns:aink="http://schemas.microsoft.com/office/drawing/2016/ink" xmlns:am3d="http://schemas.microsoft.com/office/drawing/2017/model3d" xmlns:o="urn:schemas-microsoft-com:office:office" xmlns:oel="http://schemas.microsoft.com/office/2019/extlst" xmlns:r="http://schemas.openxmlformats.org/officeDocument/2006/relationships" xmlns:m="http://schemas.openxmlformats.org/officeDocument/2006/math" xmlns:v="urn:schemas-microsoft-com:vml" xmlns:wp14="http://schemas.microsoft.com/office/word/2010/wordprocessingDrawing" xmlns:wp="http://schemas.openxmlformats.org/drawingml/2006/wordprocessingDrawing" xmlns:w10="urn:schemas-microsoft-com:office:word" xmlns:w="http://schemas.openxmlformats.org/wordprocessingml/2006/main" xmlns:w14="http://schemas.microsoft.com/office/word/2010/wordml" xmlns:w15="http://schemas.microsoft.com/office/word/2012/wordml" xmlns:w16cex="http://schemas.microsoft.com/office/word/2018/wordml/cex" xmlns:w16cid="http://schemas.microsoft.com/office/word/2016/wordml/cid" xmlns:w16="http://schemas.microsoft.com/office/word/2018/wordml" xmlns:w16du="http://schemas.microsoft.com/office/word/2023/wordml/word16du" xmlns:w16sdtdh="http://schemas.microsoft.com/office/word/2020/wordml/sdtdatahash" xmlns:w16sdtfl="http://schemas.microsoft.com/office/word/2024/wordml/sdtformatlock" xmlns:w16se="http://schemas.microsoft.com/office/word/2015/wordml/symex" xmlns:wpg="http://schemas.microsoft.com/office/word/2010/wordprocessingGroup" xmlns:wpi="http://schemas.microsoft.com/office/word/2010/wordprocessingInk" xmlns:wne="http://schemas.microsoft.com/office/word/2006/wordml" xmlns:wps="http://schemas.microsoft.com/office/word/2010/wordprocessingShape" xmlns:cr="http://schemas.microsoft.com/office/comments/2020/reactions" mc:Ignorable="w14 w15 w16se w16cid w16 w16cex w16sdtdh w16sdtfl cr w16du wp14">
+  <w16cex:commentExtensible w16cex:durableId="19B79D80" w16cex:dateUtc="2026-05-06T16:30:04Z"/>
+  <w16cex:commentExtensible w16cex:durableId="54F4DB07" w16cex:dateUtc="2026-05-06T16:31:26Z"/>
+</w16cex:commentsExtensible>
+</file>
+
+<file path=word/commentsIds.xml><?xml version="1.0" encoding="utf-8"?>
+<w16cid:commentsIds xmlns:wpc="http://schemas.microsoft.com/office/word/2010/wordprocessingCanvas" xmlns:cx="http://schemas.microsoft.com/office/drawing/2014/chartex" xmlns:cx1="http://schemas.microsoft.com/office/drawing/2015/9/8/chartex" xmlns:cx2="http://schemas.microsoft.com/office/drawing/2015/10/21/chartex" xmlns:cx3="http://schemas.microsoft.com/office/drawing/2016/5/9/chartex" xmlns:cx4="http://schemas.microsoft.com/office/drawing/2016/5/10/chartex" xmlns:cx5="http://schemas.microsoft.com/office/drawing/2016/5/11/chartex" xmlns:cx6="http://schemas.microsoft.com/office/drawing/2016/5/12/chartex" xmlns:cx7="http://schemas.microsoft.com/office/drawing/2016/5/13/chartex" xmlns:cx8="http://schemas.microsoft.com/office/drawing/2016/5/14/chartex" xmlns:mc="http://schemas.openxmlformats.org/markup-compatibility/2006" xmlns:aink="http://schemas.microsoft.com/office/drawing/2016/ink" xmlns:am3d="http://schemas.microsoft.com/office/drawing/2017/model3d" xmlns:o="urn:schemas-microsoft-com:office:office" xmlns:oel="http://schemas.microsoft.com/office/2019/extlst" xmlns:r="http://schemas.openxmlformats.org/officeDocument/2006/relationships" xmlns:m="http://schemas.openxmlformats.org/officeDocument/2006/math" xmlns:v="urn:schemas-microsoft-com:vml" xmlns:wp14="http://schemas.microsoft.com/office/word/2010/wordprocessingDrawing" xmlns:wp="http://schemas.openxmlformats.org/drawingml/2006/wordprocessingDrawing" xmlns:w10="urn:schemas-microsoft-com:office:word" xmlns:w="http://schemas.openxmlformats.org/wordprocessingml/2006/main" xmlns:w14="http://schemas.microsoft.com/office/word/2010/wordml" xmlns:w15="http://schemas.microsoft.com/office/word/2012/wordml" xmlns:w16cex="http://schemas.microsoft.com/office/word/2018/wordml/cex" xmlns:w16cid="http://schemas.microsoft.com/office/word/2016/wordml/cid" xmlns:w16="http://schemas.microsoft.com/office/word/2018/wordml" xmlns:w16du="http://schemas.microsoft.com/office/word/2023/wordml/word16du" xmlns:w16sdtdh="http://schemas.microsoft.com/office/word/2020/wordml/sdtdatahash" xmlns:w16sdtfl="http://schemas.microsoft.com/office/word/2024/wordml/sdtformatlock" xmlns:w16se="http://schemas.microsoft.com/office/word/2015/wordml/symex" xmlns:wpg="http://schemas.microsoft.com/office/word/2010/wordprocessingGroup" xmlns:wpi="http://schemas.microsoft.com/office/word/2010/wordprocessingInk" xmlns:wne="http://schemas.microsoft.com/office/word/2006/wordml" xmlns:wps="http://schemas.microsoft.com/office/word/2010/wordprocessingShape" mc:Ignorable="w14 w15 w16se w16cid w16 w16cex w16sdtdh w16sdtfl w16du wp14">
+  <w16cid:commentId w16cid:paraId="7BE2DE87" w16cid:durableId="19B79D80"/>
+  <w16cid:commentId w16cid:paraId="5CEEDFAF" w16cid:durableId="54F4DB07"/>
+</w16cid:commentsIds>
 </file>
 
 <file path=word/numbering.xml><?xml version="1.0" encoding="utf-8"?>

</xml_diff>